<commit_message>
fixed just deleting the markers if the section was not removed, also added pricing changing.
</commit_message>
<xml_diff>
--- a/src/main/resources/baseDocument.docx
+++ b/src/main/resources/baseDocument.docx
@@ -626,7 +626,47 @@
           <w:sz w:val="24"/>
           <w:szCs w:val="24"/>
         </w:rPr>
-        <w:t>el costo de $50,00 por persona más I.V.A, tarifa diaria.</w:t>
+        <w:t xml:space="preserve">el costo </w:t>
+      </w:r>
+      <w:r>
+        <w:rPr>
+          <w:rFonts w:cstheme="minorHAnsi"/>
+          <w:b/>
+          <w:bCs/>
+          <w:sz w:val="24"/>
+          <w:szCs w:val="24"/>
+        </w:rPr>
+        <w:t xml:space="preserve">de </w:t>
+      </w:r>
+      <w:r>
+        <w:rPr>
+          <w:rFonts w:cstheme="minorHAnsi"/>
+          <w:b/>
+          <w:bCs/>
+          <w:sz w:val="24"/>
+          <w:szCs w:val="24"/>
+        </w:rPr>
+        <w:t xml:space="preserve">$ </w:t>
+      </w:r>
+      <w:r>
+        <w:rPr>
+          <w:rFonts w:cstheme="minorHAnsi"/>
+          <w:b/>
+          <w:bCs/>
+          <w:sz w:val="24"/>
+          <w:szCs w:val="24"/>
+        </w:rPr>
+        <w:t xml:space="preserve">{{PRECIO_INDIVIDUAL}} </w:t>
+      </w:r>
+      <w:r>
+        <w:rPr>
+          <w:rFonts w:cstheme="minorHAnsi"/>
+          <w:b/>
+          <w:bCs/>
+          <w:sz w:val="24"/>
+          <w:szCs w:val="24"/>
+        </w:rPr>
+        <w:t>por persona más I.V.A, tarifa diaria.</w:t>
       </w:r>
     </w:p>
     <w:p>
@@ -662,7 +702,37 @@
           <w:sz w:val="24"/>
           <w:szCs w:val="24"/>
         </w:rPr>
-        <w:t>el costo de $40,00 por persona más I.V.A, tarifa diaria.</w:t>
+        <w:t xml:space="preserve">el costo de </w:t>
+      </w:r>
+      <w:r>
+        <w:rPr>
+          <w:rFonts w:cstheme="minorHAnsi"/>
+          <w:b/>
+          <w:bCs/>
+          <w:sz w:val="24"/>
+          <w:szCs w:val="24"/>
+        </w:rPr>
+        <w:t xml:space="preserve">$ </w:t>
+      </w:r>
+      <w:r>
+        <w:rPr>
+          <w:rFonts w:cstheme="minorHAnsi"/>
+          <w:b/>
+          <w:bCs/>
+          <w:sz w:val="24"/>
+          <w:szCs w:val="24"/>
+        </w:rPr>
+        <w:t xml:space="preserve">{{PRECIO_DOBLE}} </w:t>
+      </w:r>
+      <w:r>
+        <w:rPr>
+          <w:rFonts w:cstheme="minorHAnsi"/>
+          <w:b/>
+          <w:bCs/>
+          <w:sz w:val="24"/>
+          <w:szCs w:val="24"/>
+        </w:rPr>
+        <w:t>por persona más I.V.A, tarifa diaria.</w:t>
       </w:r>
     </w:p>
     <w:p>
@@ -722,7 +792,7 @@
           <w:sz w:val="24"/>
           <w:szCs w:val="24"/>
         </w:rPr>
-        <w:t>l costo de $35</w:t>
+        <w:t xml:space="preserve">l costo de </w:t>
       </w:r>
       <w:r>
         <w:rPr>
@@ -732,7 +802,7 @@
           <w:sz w:val="24"/>
           <w:szCs w:val="24"/>
         </w:rPr>
-        <w:t>,00</w:t>
+        <w:t xml:space="preserve">$ </w:t>
       </w:r>
       <w:r>
         <w:rPr>
@@ -742,7 +812,37 @@
           <w:sz w:val="24"/>
           <w:szCs w:val="24"/>
         </w:rPr>
-        <w:t xml:space="preserve"> por persona más I.V.A, tarifa diaria.</w:t>
+        <w:t>{{</w:t>
+      </w:r>
+      <w:r>
+        <w:rPr>
+          <w:rFonts w:cstheme="minorHAnsi"/>
+          <w:b/>
+          <w:bCs/>
+          <w:sz w:val="24"/>
+          <w:szCs w:val="24"/>
+        </w:rPr>
+        <w:t>PRECIO_MULTIPLE</w:t>
+      </w:r>
+      <w:r>
+        <w:rPr>
+          <w:rFonts w:cstheme="minorHAnsi"/>
+          <w:b/>
+          <w:bCs/>
+          <w:sz w:val="24"/>
+          <w:szCs w:val="24"/>
+        </w:rPr>
+        <w:t xml:space="preserve">}} </w:t>
+      </w:r>
+      <w:r>
+        <w:rPr>
+          <w:rFonts w:cstheme="minorHAnsi"/>
+          <w:b/>
+          <w:bCs/>
+          <w:sz w:val="24"/>
+          <w:szCs w:val="24"/>
+        </w:rPr>
+        <w:t>por persona más I.V.A, tarifa diaria.</w:t>
       </w:r>
     </w:p>
     <w:p>
@@ -843,7 +943,16 @@
           <w:sz w:val="24"/>
           <w:szCs w:val="24"/>
         </w:rPr>
-        <w:t xml:space="preserve"> y para la salida el </w:t>
+        <w:t xml:space="preserve"> y para la salida </w:t>
+      </w:r>
+      <w:r>
+        <w:rPr>
+          <w:rFonts w:cstheme="minorHAnsi"/>
+          <w:sz w:val="24"/>
+          <w:szCs w:val="24"/>
+        </w:rPr>
+        <w:lastRenderedPageBreak/>
+        <w:t xml:space="preserve">el </w:t>
       </w:r>
       <w:r>
         <w:rPr>
@@ -904,27 +1013,29 @@
           <w:rFonts w:cstheme="minorHAnsi"/>
           <w:sz w:val="24"/>
           <w:szCs w:val="24"/>
-        </w:rPr>
-      </w:pPr>
-      <w:r>
-        <w:rPr>
-          <w:rFonts w:cstheme="minorHAnsi"/>
-          <w:sz w:val="24"/>
-          <w:szCs w:val="24"/>
           <w:lang w:eastAsia="ja-JP"/>
         </w:rPr>
-        <w:lastRenderedPageBreak/>
+      </w:pPr>
+      <w:r>
+        <w:rPr>
+          <w:rFonts w:cstheme="minorHAnsi"/>
+          <w:sz w:val="24"/>
+          <w:szCs w:val="24"/>
+          <w:lang w:eastAsia="ja-JP"/>
+        </w:rPr>
         <w:t>{{END_HOSPEDAJE}}</w:t>
       </w:r>
-      <w:r>
-        <w:rPr>
-          <w:rFonts w:cstheme="minorHAnsi"/>
-          <w:sz w:val="24"/>
-          <w:szCs w:val="24"/>
-          <w:lang w:eastAsia="ja-JP"/>
-        </w:rPr>
-        <w:br/>
-      </w:r>
+    </w:p>
+    <w:p>
+      <w:pPr>
+        <w:spacing w:line="360" w:lineRule="auto"/>
+        <w:jc w:val="both"/>
+        <w:rPr>
+          <w:rFonts w:cstheme="minorHAnsi"/>
+          <w:sz w:val="24"/>
+          <w:szCs w:val="24"/>
+        </w:rPr>
+      </w:pPr>
       <w:r>
         <w:rPr>
           <w:rFonts w:cstheme="minorHAnsi"/>
@@ -1113,6 +1224,8 @@
         <w:spacing w:line="360" w:lineRule="auto"/>
         <w:jc w:val="both"/>
         <w:rPr>
+          <w:b/>
+          <w:bCs/>
           <w:i/>
           <w:color w:val="000000"/>
           <w:sz w:val="24"/>
@@ -1121,22 +1234,48 @@
       </w:pPr>
       <w:r>
         <w:rPr>
-          <w:i/>
-          <w:sz w:val="24"/>
-          <w:szCs w:val="24"/>
-        </w:rPr>
-        <w:t>Costo por persona $</w:t>
-      </w:r>
-      <w:r>
-        <w:rPr>
-          <w:i/>
-          <w:sz w:val="24"/>
-          <w:szCs w:val="24"/>
-        </w:rPr>
-        <w:t>{{PRECIO_TRADICIONAL}}</w:t>
-      </w:r>
-      <w:r>
-        <w:rPr>
+          <w:b/>
+          <w:bCs/>
+          <w:i/>
+          <w:sz w:val="24"/>
+          <w:szCs w:val="24"/>
+        </w:rPr>
+        <w:t>Costo por persona ${{PRECIO_</w:t>
+      </w:r>
+      <w:r>
+        <w:rPr>
+          <w:b/>
+          <w:bCs/>
+          <w:i/>
+          <w:sz w:val="24"/>
+          <w:szCs w:val="24"/>
+        </w:rPr>
+        <w:t>ESENCIA</w:t>
+      </w:r>
+      <w:r>
+        <w:rPr>
+          <w:b/>
+          <w:bCs/>
+          <w:i/>
+          <w:sz w:val="24"/>
+          <w:szCs w:val="24"/>
+        </w:rPr>
+        <w:t>L}}</w:t>
+      </w:r>
+      <w:r>
+        <w:rPr>
+          <w:b/>
+          <w:bCs/>
+          <w:i/>
+          <w:sz w:val="24"/>
+          <w:szCs w:val="24"/>
+        </w:rPr>
+        <w:t xml:space="preserve"> </w:t>
+      </w:r>
+      <w:r>
+        <w:rPr>
+          <w:b/>
+          <w:bCs/>
           <w:i/>
           <w:sz w:val="24"/>
           <w:szCs w:val="24"/>
@@ -1236,7 +1375,6 @@
         </w:rPr>
         <w:t xml:space="preserve"> </w:t>
       </w:r>
-      <w:proofErr w:type="spellStart"/>
       <w:r>
         <w:rPr>
           <w:spacing w:val="-4"/>
@@ -1244,7 +1382,6 @@
         </w:rPr>
         <w:t>Soft</w:t>
       </w:r>
-      <w:proofErr w:type="spellEnd"/>
     </w:p>
     <w:p>
       <w:pPr>
@@ -1592,6 +1729,11 @@
       <w:pPr>
         <w:pStyle w:val="Heading2"/>
         <w:spacing w:before="0"/>
+        <w:rPr>
+          <w:color w:val="000000"/>
+          <w:spacing w:val="-2"/>
+          <w:shd w:val="clear" w:color="auto" w:fill="A9A9A9"/>
+        </w:rPr>
       </w:pPr>
       <w:r>
         <w:rPr>
@@ -1739,15 +1881,9 @@
     </w:p>
     <w:p>
       <w:pPr>
-        <w:pStyle w:val="Heading2"/>
-        <w:sectPr>
-          <w:headerReference w:type="default" r:id="rId8"/>
-          <w:footerReference w:type="default" r:id="rId9"/>
-          <w:pgSz w:w="11910" w:h="16840"/>
-          <w:pgMar w:top="2000" w:right="1133" w:bottom="1880" w:left="1700" w:header="328" w:footer="1691" w:gutter="0"/>
-          <w:pgNumType w:start="1"/>
-          <w:cols w:space="720"/>
-        </w:sectPr>
+        <w:rPr>
+          <w:highlight w:val="darkYellow"/>
+        </w:rPr>
       </w:pPr>
     </w:p>
     <w:p>
@@ -1759,8 +1895,6 @@
           <w:sz w:val="24"/>
         </w:rPr>
       </w:pPr>
-      <w:bookmarkStart w:id="3" w:name="ALMUERZO_DE_LA_CASA"/>
-      <w:bookmarkEnd w:id="3"/>
       <w:r>
         <w:rPr>
           <w:i/>
@@ -1836,8 +1970,8 @@
         </w:rPr>
         <w:t xml:space="preserve"> </w:t>
       </w:r>
-      <w:bookmarkStart w:id="4" w:name="ALMUERZOS_OPCIÓN_1"/>
-      <w:bookmarkEnd w:id="4"/>
+      <w:bookmarkStart w:id="3" w:name="ALMUERZOS_OPCIÓN_1"/>
+      <w:bookmarkEnd w:id="3"/>
       <w:r>
         <w:rPr>
           <w:i/>
@@ -1868,8 +2002,8 @@
           <w:sz w:val="24"/>
         </w:rPr>
       </w:pPr>
-      <w:bookmarkStart w:id="5" w:name="_Entrada:_sopa_de_pollo"/>
-      <w:bookmarkEnd w:id="5"/>
+      <w:bookmarkStart w:id="4" w:name="_Entrada:_sopa_de_pollo"/>
+      <w:bookmarkEnd w:id="4"/>
       <w:r>
         <w:rPr>
           <w:sz w:val="24"/>
@@ -1931,159 +2065,159 @@
           <w:sz w:val="24"/>
         </w:rPr>
       </w:pPr>
-      <w:bookmarkStart w:id="6" w:name="_Plato_fuerte:_chuleta_de_cerdo_a_la_pl"/>
+      <w:bookmarkStart w:id="5" w:name="_Plato_fuerte:_chuleta_de_cerdo_a_la_pl"/>
+      <w:bookmarkEnd w:id="5"/>
+      <w:r>
+        <w:rPr>
+          <w:sz w:val="24"/>
+        </w:rPr>
+        <w:t>Plato</w:t>
+      </w:r>
+      <w:r>
+        <w:rPr>
+          <w:spacing w:val="-4"/>
+          <w:sz w:val="24"/>
+        </w:rPr>
+        <w:t xml:space="preserve"> </w:t>
+      </w:r>
+      <w:r>
+        <w:rPr>
+          <w:sz w:val="24"/>
+        </w:rPr>
+        <w:t>fuerte:</w:t>
+      </w:r>
+      <w:r>
+        <w:rPr>
+          <w:spacing w:val="-2"/>
+          <w:sz w:val="24"/>
+        </w:rPr>
+        <w:t xml:space="preserve"> </w:t>
+      </w:r>
+      <w:r>
+        <w:rPr>
+          <w:sz w:val="24"/>
+        </w:rPr>
+        <w:t>chuleta</w:t>
+      </w:r>
+      <w:r>
+        <w:rPr>
+          <w:spacing w:val="-5"/>
+          <w:sz w:val="24"/>
+        </w:rPr>
+        <w:t xml:space="preserve"> </w:t>
+      </w:r>
+      <w:r>
+        <w:rPr>
+          <w:sz w:val="24"/>
+        </w:rPr>
+        <w:t>de</w:t>
+      </w:r>
+      <w:r>
+        <w:rPr>
+          <w:spacing w:val="-2"/>
+          <w:sz w:val="24"/>
+        </w:rPr>
+        <w:t xml:space="preserve"> </w:t>
+      </w:r>
+      <w:r>
+        <w:rPr>
+          <w:sz w:val="24"/>
+        </w:rPr>
+        <w:t>cerdo</w:t>
+      </w:r>
+      <w:r>
+        <w:rPr>
+          <w:spacing w:val="-4"/>
+          <w:sz w:val="24"/>
+        </w:rPr>
+        <w:t xml:space="preserve"> </w:t>
+      </w:r>
+      <w:r>
+        <w:rPr>
+          <w:sz w:val="24"/>
+        </w:rPr>
+        <w:t>a</w:t>
+      </w:r>
+      <w:r>
+        <w:rPr>
+          <w:spacing w:val="-2"/>
+          <w:sz w:val="24"/>
+        </w:rPr>
+        <w:t xml:space="preserve"> </w:t>
+      </w:r>
+      <w:r>
+        <w:rPr>
+          <w:sz w:val="24"/>
+        </w:rPr>
+        <w:t>la</w:t>
+      </w:r>
+      <w:r>
+        <w:rPr>
+          <w:spacing w:val="-5"/>
+          <w:sz w:val="24"/>
+        </w:rPr>
+        <w:t xml:space="preserve"> </w:t>
+      </w:r>
+      <w:r>
+        <w:rPr>
+          <w:sz w:val="24"/>
+        </w:rPr>
+        <w:t>plancha</w:t>
+      </w:r>
+      <w:r>
+        <w:rPr>
+          <w:spacing w:val="-2"/>
+          <w:sz w:val="24"/>
+        </w:rPr>
+        <w:t xml:space="preserve"> </w:t>
+      </w:r>
+      <w:r>
+        <w:rPr>
+          <w:sz w:val="24"/>
+        </w:rPr>
+        <w:t>en</w:t>
+      </w:r>
+      <w:r>
+        <w:rPr>
+          <w:spacing w:val="-1"/>
+          <w:sz w:val="24"/>
+        </w:rPr>
+        <w:t xml:space="preserve"> </w:t>
+      </w:r>
+      <w:r>
+        <w:rPr>
+          <w:sz w:val="24"/>
+        </w:rPr>
+        <w:t>salsa</w:t>
+      </w:r>
+      <w:r>
+        <w:rPr>
+          <w:spacing w:val="-2"/>
+          <w:sz w:val="24"/>
+        </w:rPr>
+        <w:t xml:space="preserve"> </w:t>
+      </w:r>
+      <w:r>
+        <w:rPr>
+          <w:sz w:val="24"/>
+        </w:rPr>
+        <w:t>de</w:t>
+      </w:r>
+      <w:r>
+        <w:rPr>
+          <w:spacing w:val="-4"/>
+          <w:sz w:val="24"/>
+        </w:rPr>
+        <w:t xml:space="preserve"> </w:t>
+      </w:r>
+      <w:r>
+        <w:rPr>
+          <w:sz w:val="24"/>
+        </w:rPr>
+        <w:t xml:space="preserve">champiñones </w:t>
+      </w:r>
+      <w:bookmarkStart w:id="6" w:name="Guarniciones:_arroz_verde,_ensalada_Wald"/>
       <w:bookmarkEnd w:id="6"/>
-      <w:r>
-        <w:rPr>
-          <w:sz w:val="24"/>
-        </w:rPr>
-        <w:t>Plato</w:t>
-      </w:r>
-      <w:r>
-        <w:rPr>
-          <w:spacing w:val="-4"/>
-          <w:sz w:val="24"/>
-        </w:rPr>
-        <w:t xml:space="preserve"> </w:t>
-      </w:r>
-      <w:r>
-        <w:rPr>
-          <w:sz w:val="24"/>
-        </w:rPr>
-        <w:t>fuerte:</w:t>
-      </w:r>
-      <w:r>
-        <w:rPr>
-          <w:spacing w:val="-2"/>
-          <w:sz w:val="24"/>
-        </w:rPr>
-        <w:t xml:space="preserve"> </w:t>
-      </w:r>
-      <w:r>
-        <w:rPr>
-          <w:sz w:val="24"/>
-        </w:rPr>
-        <w:t>chuleta</w:t>
-      </w:r>
-      <w:r>
-        <w:rPr>
-          <w:spacing w:val="-5"/>
-          <w:sz w:val="24"/>
-        </w:rPr>
-        <w:t xml:space="preserve"> </w:t>
-      </w:r>
-      <w:r>
-        <w:rPr>
-          <w:sz w:val="24"/>
-        </w:rPr>
-        <w:t>de</w:t>
-      </w:r>
-      <w:r>
-        <w:rPr>
-          <w:spacing w:val="-2"/>
-          <w:sz w:val="24"/>
-        </w:rPr>
-        <w:t xml:space="preserve"> </w:t>
-      </w:r>
-      <w:r>
-        <w:rPr>
-          <w:sz w:val="24"/>
-        </w:rPr>
-        <w:t>cerdo</w:t>
-      </w:r>
-      <w:r>
-        <w:rPr>
-          <w:spacing w:val="-4"/>
-          <w:sz w:val="24"/>
-        </w:rPr>
-        <w:t xml:space="preserve"> </w:t>
-      </w:r>
-      <w:r>
-        <w:rPr>
-          <w:sz w:val="24"/>
-        </w:rPr>
-        <w:t>a</w:t>
-      </w:r>
-      <w:r>
-        <w:rPr>
-          <w:spacing w:val="-2"/>
-          <w:sz w:val="24"/>
-        </w:rPr>
-        <w:t xml:space="preserve"> </w:t>
-      </w:r>
-      <w:r>
-        <w:rPr>
-          <w:sz w:val="24"/>
-        </w:rPr>
-        <w:t>la</w:t>
-      </w:r>
-      <w:r>
-        <w:rPr>
-          <w:spacing w:val="-5"/>
-          <w:sz w:val="24"/>
-        </w:rPr>
-        <w:t xml:space="preserve"> </w:t>
-      </w:r>
-      <w:r>
-        <w:rPr>
-          <w:sz w:val="24"/>
-        </w:rPr>
-        <w:t>plancha</w:t>
-      </w:r>
-      <w:r>
-        <w:rPr>
-          <w:spacing w:val="-2"/>
-          <w:sz w:val="24"/>
-        </w:rPr>
-        <w:t xml:space="preserve"> </w:t>
-      </w:r>
-      <w:r>
-        <w:rPr>
-          <w:sz w:val="24"/>
-        </w:rPr>
-        <w:t>en</w:t>
-      </w:r>
-      <w:r>
-        <w:rPr>
-          <w:spacing w:val="-1"/>
-          <w:sz w:val="24"/>
-        </w:rPr>
-        <w:t xml:space="preserve"> </w:t>
-      </w:r>
-      <w:r>
-        <w:rPr>
-          <w:sz w:val="24"/>
-        </w:rPr>
-        <w:t>salsa</w:t>
-      </w:r>
-      <w:r>
-        <w:rPr>
-          <w:spacing w:val="-2"/>
-          <w:sz w:val="24"/>
-        </w:rPr>
-        <w:t xml:space="preserve"> </w:t>
-      </w:r>
-      <w:r>
-        <w:rPr>
-          <w:sz w:val="24"/>
-        </w:rPr>
-        <w:t>de</w:t>
-      </w:r>
-      <w:r>
-        <w:rPr>
-          <w:spacing w:val="-4"/>
-          <w:sz w:val="24"/>
-        </w:rPr>
-        <w:t xml:space="preserve"> </w:t>
-      </w:r>
-      <w:r>
-        <w:rPr>
-          <w:sz w:val="24"/>
-        </w:rPr>
-        <w:t xml:space="preserve">champiñones </w:t>
-      </w:r>
-      <w:bookmarkStart w:id="7" w:name="Guarniciones:_arroz_verde,_ensalada_Wald"/>
-      <w:bookmarkEnd w:id="7"/>
       <w:r>
         <w:rPr>
           <w:sz w:val="24"/>
@@ -2181,8 +2315,8 @@
           <w:sz w:val="24"/>
         </w:rPr>
       </w:pPr>
-      <w:bookmarkStart w:id="8" w:name="ALMUERZOS_OPCIÓN_2"/>
-      <w:bookmarkEnd w:id="8"/>
+      <w:bookmarkStart w:id="7" w:name="ALMUERZOS_OPCIÓN_2"/>
+      <w:bookmarkEnd w:id="7"/>
       <w:r>
         <w:rPr>
           <w:i/>
@@ -2243,8 +2377,8 @@
           <w:sz w:val="24"/>
         </w:rPr>
       </w:pPr>
-      <w:bookmarkStart w:id="9" w:name="_Entrada:_crema_de_vegetales"/>
-      <w:bookmarkEnd w:id="9"/>
+      <w:bookmarkStart w:id="8" w:name="_Entrada:_crema_de_vegetales"/>
+      <w:bookmarkEnd w:id="8"/>
       <w:r>
         <w:rPr>
           <w:sz w:val="24"/>
@@ -2313,8 +2447,8 @@
           <w:sz w:val="24"/>
         </w:rPr>
       </w:pPr>
-      <w:bookmarkStart w:id="10" w:name="_Plato_fuerte:_pollo_al_horno"/>
-      <w:bookmarkEnd w:id="10"/>
+      <w:bookmarkStart w:id="9" w:name="_Plato_fuerte:_pollo_al_horno"/>
+      <w:bookmarkEnd w:id="9"/>
       <w:r>
         <w:rPr>
           <w:sz w:val="24"/>
@@ -2383,8 +2517,8 @@
           <w:sz w:val="24"/>
         </w:rPr>
       </w:pPr>
-      <w:bookmarkStart w:id="11" w:name="Guarniciones:_milhoja_de_papa,_ensalada_"/>
-      <w:bookmarkEnd w:id="11"/>
+      <w:bookmarkStart w:id="10" w:name="Guarniciones:_milhoja_de_papa,_ensalada_"/>
+      <w:bookmarkEnd w:id="10"/>
       <w:r>
         <w:rPr>
           <w:sz w:val="24"/>
@@ -2593,6 +2727,25 @@
         <w:spacing w:after="0" w:line="240" w:lineRule="auto"/>
         <w:jc w:val="both"/>
         <w:rPr>
+          <w:rFonts w:cstheme="minorHAnsi"/>
+          <w:sz w:val="24"/>
+          <w:szCs w:val="24"/>
+        </w:rPr>
+      </w:pPr>
+      <w:r>
+        <w:rPr>
+          <w:rFonts w:cstheme="minorHAnsi"/>
+          <w:sz w:val="24"/>
+          <w:szCs w:val="24"/>
+        </w:rPr>
+        <w:t>{{START_PLAN_TRADICIONAL}}</w:t>
+      </w:r>
+    </w:p>
+    <w:p>
+      <w:pPr>
+        <w:spacing w:after="0" w:line="240" w:lineRule="auto"/>
+        <w:jc w:val="both"/>
+        <w:rPr>
           <w:rFonts w:ascii="Bradley Hand ITC" w:hAnsi="Bradley Hand ITC" w:cstheme="minorHAnsi"/>
           <w:b/>
           <w:color w:val="70AD47" w:themeColor="accent6"/>
@@ -2602,23 +2755,6 @@
       </w:pPr>
       <w:r>
         <w:rPr>
-          <w:rFonts w:cstheme="minorHAnsi"/>
-          <w:sz w:val="24"/>
-          <w:szCs w:val="24"/>
-        </w:rPr>
-        <w:t>{{START_PLAN_TRADICIONAL}}</w:t>
-      </w:r>
-      <w:r>
-        <w:rPr>
-          <w:rFonts w:ascii="Bradley Hand ITC" w:hAnsi="Bradley Hand ITC" w:cstheme="minorHAnsi"/>
-          <w:b/>
-          <w:color w:val="70AD47" w:themeColor="accent6"/>
-          <w:sz w:val="36"/>
-        </w:rPr>
-        <w:br/>
-      </w:r>
-      <w:r>
-        <w:rPr>
           <w:rFonts w:ascii="Bradley Hand ITC" w:hAnsi="Bradley Hand ITC" w:cstheme="minorHAnsi"/>
           <w:b/>
           <w:color w:val="70AD47" w:themeColor="accent6"/>
@@ -2659,6 +2795,16 @@
           <w:szCs w:val="24"/>
         </w:rPr>
         <w:t>Costo por persona $</w:t>
+      </w:r>
+      <w:r>
+        <w:rPr>
+          <w:b/>
+          <w:bCs/>
+          <w:i/>
+          <w:sz w:val="24"/>
+          <w:szCs w:val="24"/>
+        </w:rPr>
+        <w:t xml:space="preserve"> </w:t>
       </w:r>
       <w:r>
         <w:rPr>
@@ -2736,18 +2882,8 @@
           <w:sz w:val="24"/>
           <w:szCs w:val="24"/>
         </w:rPr>
-        <w:t xml:space="preserve">Bebidas </w:t>
-      </w:r>
-      <w:proofErr w:type="spellStart"/>
-      <w:r>
-        <w:rPr>
-          <w:b w:val="0"/>
-          <w:sz w:val="24"/>
-          <w:szCs w:val="24"/>
-        </w:rPr>
-        <w:t>Soft</w:t>
-      </w:r>
-      <w:proofErr w:type="spellEnd"/>
+        <w:t>Bebidas Soft</w:t>
+      </w:r>
     </w:p>
     <w:p>
       <w:pPr>
@@ -3317,7 +3453,47 @@
           <w:sz w:val="24"/>
           <w:szCs w:val="24"/>
         </w:rPr>
-        <w:t>{{PRECIO_TRADICIONAL}}</w:t>
+        <w:t xml:space="preserve"> </w:t>
+      </w:r>
+      <w:r>
+        <w:rPr>
+          <w:i/>
+          <w:sz w:val="24"/>
+          <w:szCs w:val="24"/>
+        </w:rPr>
+        <w:t>{{PRECIO_</w:t>
+      </w:r>
+      <w:r>
+        <w:rPr>
+          <w:i/>
+          <w:sz w:val="24"/>
+          <w:szCs w:val="24"/>
+        </w:rPr>
+        <w:t>PAR</w:t>
+      </w:r>
+      <w:r>
+        <w:rPr>
+          <w:i/>
+          <w:sz w:val="24"/>
+          <w:szCs w:val="24"/>
+        </w:rPr>
+        <w:t>R</w:t>
+      </w:r>
+      <w:r>
+        <w:rPr>
+          <w:i/>
+          <w:sz w:val="24"/>
+          <w:szCs w:val="24"/>
+        </w:rPr>
+        <w:t>ILLERO</w:t>
+      </w:r>
+      <w:r>
+        <w:rPr>
+          <w:i/>
+          <w:sz w:val="24"/>
+          <w:szCs w:val="24"/>
+        </w:rPr>
+        <w:t>}}</w:t>
       </w:r>
       <w:r>
         <w:rPr>
@@ -3391,18 +3567,8 @@
           <w:sz w:val="24"/>
           <w:szCs w:val="24"/>
         </w:rPr>
-        <w:t xml:space="preserve">Bebidas </w:t>
-      </w:r>
-      <w:proofErr w:type="spellStart"/>
-      <w:r>
-        <w:rPr>
-          <w:b w:val="0"/>
-          <w:sz w:val="24"/>
-          <w:szCs w:val="24"/>
-        </w:rPr>
-        <w:t>Soft</w:t>
-      </w:r>
-      <w:proofErr w:type="spellEnd"/>
+        <w:t>Bebidas Soft</w:t>
+      </w:r>
     </w:p>
     <w:p>
       <w:pPr>
@@ -4270,8 +4436,8 @@
       </w:pPr>
     </w:p>
     <w:sectPr>
-      <w:headerReference w:type="default" r:id="rId10"/>
-      <w:footerReference w:type="default" r:id="rId11"/>
+      <w:headerReference w:type="default" r:id="rId8"/>
+      <w:footerReference w:type="default" r:id="rId9"/>
       <w:pgSz w:w="11906" w:h="16838" w:code="9"/>
       <w:pgMar w:top="1829" w:right="1274" w:bottom="2127" w:left="1701" w:header="709" w:footer="709" w:gutter="0"/>
       <w:cols w:space="708"/>
@@ -4307,638 +4473,6 @@
 </file>
 
 <file path=word/footer1.xml><?xml version="1.0" encoding="utf-8"?>
-<w:ftr xmlns:wpc="http://schemas.microsoft.com/office/word/2010/wordprocessingCanvas" xmlns:cx="http://schemas.microsoft.com/office/drawing/2014/chartex" xmlns:cx1="http://schemas.microsoft.com/office/drawing/2015/9/8/chartex" xmlns:cx2="http://schemas.microsoft.com/office/drawing/2015/10/21/chartex" xmlns:cx3="http://schemas.microsoft.com/office/drawing/2016/5/9/chartex" xmlns:cx4="http://schemas.microsoft.com/office/drawing/2016/5/10/chartex" xmlns:cx5="http://schemas.microsoft.com/office/drawing/2016/5/11/chartex" xmlns:cx6="http://schemas.microsoft.com/office/drawing/2016/5/12/chartex" xmlns:cx7="http://schemas.microsoft.com/office/drawing/2016/5/13/chartex" xmlns:cx8="http://schemas.microsoft.com/office/drawing/2016/5/14/chartex" xmlns:mc="http://schemas.openxmlformats.org/markup-compatibility/2006" xmlns:aink="http://schemas.microsoft.com/office/drawing/2016/ink" xmlns:am3d="http://schemas.microsoft.com/office/drawing/2017/model3d" xmlns:o="urn:schemas-microsoft-com:office:office" xmlns:oel="http://schemas.microsoft.com/office/2019/extlst" xmlns:r="http://schemas.openxmlformats.org/officeDocument/2006/relationships" xmlns:m="http://schemas.openxmlformats.org/officeDocument/2006/math" xmlns:v="urn:schemas-microsoft-com:vml" xmlns:wp14="http://schemas.microsoft.com/office/word/2010/wordprocessingDrawing" xmlns:wp="http://schemas.openxmlformats.org/drawingml/2006/wordprocessingDrawing" xmlns:w10="urn:schemas-microsoft-com:office:word" xmlns:w="http://schemas.openxmlformats.org/wordprocessingml/2006/main" xmlns:w14="http://schemas.microsoft.com/office/word/2010/wordml" xmlns:w15="http://schemas.microsoft.com/office/word/2012/wordml" xmlns:w16cex="http://schemas.microsoft.com/office/word/2018/wordml/cex" xmlns:w16cid="http://schemas.microsoft.com/office/word/2016/wordml/cid" xmlns:w16="http://schemas.microsoft.com/office/word/2018/wordml" xmlns:w16du="http://schemas.microsoft.com/office/word/2023/wordml/word16du" xmlns:w16sdtdh="http://schemas.microsoft.com/office/word/2020/wordml/sdtdatahash" xmlns:w16sdtfl="http://schemas.microsoft.com/office/word/2024/wordml/sdtformatlock" xmlns:w16se="http://schemas.microsoft.com/office/word/2015/wordml/symex" xmlns:wpg="http://schemas.microsoft.com/office/word/2010/wordprocessingGroup" xmlns:wpi="http://schemas.microsoft.com/office/word/2010/wordprocessingInk" xmlns:wne="http://schemas.microsoft.com/office/word/2006/wordml" xmlns:wps="http://schemas.microsoft.com/office/word/2010/wordprocessingShape" mc:Ignorable="w14 w15 w16se w16cid w16 w16cex w16sdtdh w16sdtfl w16du wp14">
-  <w:p>
-    <w:pPr>
-      <w:pStyle w:val="BodyText"/>
-      <w:spacing w:line="14" w:lineRule="auto"/>
-      <w:rPr>
-        <w:sz w:val="20"/>
-      </w:rPr>
-    </w:pPr>
-    <w:r>
-      <w:rPr>
-        <w:noProof/>
-        <w:sz w:val="20"/>
-      </w:rPr>
-      <mc:AlternateContent>
-        <mc:Choice Requires="wps">
-          <w:drawing>
-            <wp:anchor distT="0" distB="0" distL="0" distR="0" simplePos="0" relativeHeight="251661312" behindDoc="1" locked="0" layoutInCell="1" allowOverlap="1" wp14:anchorId="3D766ED5" wp14:editId="0386B2C1">
-              <wp:simplePos x="0" y="0"/>
-              <wp:positionH relativeFrom="page">
-                <wp:posOffset>1067816</wp:posOffset>
-              </wp:positionH>
-              <wp:positionV relativeFrom="page">
-                <wp:posOffset>9478771</wp:posOffset>
-              </wp:positionV>
-              <wp:extent cx="4781550" cy="574040"/>
-              <wp:effectExtent l="0" t="0" r="0" b="0"/>
-              <wp:wrapNone/>
-              <wp:docPr id="2" name="Textbox 2"/>
-              <wp:cNvGraphicFramePr>
-                <a:graphicFrameLocks xmlns:a="http://schemas.openxmlformats.org/drawingml/2006/main"/>
-              </wp:cNvGraphicFramePr>
-              <a:graphic xmlns:a="http://schemas.openxmlformats.org/drawingml/2006/main">
-                <a:graphicData uri="http://schemas.microsoft.com/office/word/2010/wordprocessingShape">
-                  <wps:wsp>
-                    <wps:cNvSpPr txBox="1">
-                      <a:spLocks/>
-                    </wps:cNvSpPr>
-                    <wps:spPr>
-                      <a:xfrm>
-                        <a:off x="0" y="0"/>
-                        <a:ext cx="4781550" cy="574040"/>
-                      </a:xfrm>
-                      <a:prstGeom prst="rect">
-                        <a:avLst/>
-                      </a:prstGeom>
-                    </wps:spPr>
-                    <wps:txbx>
-                      <w:txbxContent>
-                        <w:p>
-                          <w:pPr>
-                            <w:pStyle w:val="Header"/>
-                            <w:spacing w:line="245" w:lineRule="exact"/>
-                            <w:ind w:left="20"/>
-                            <w:rPr>
-                              <w:rFonts w:ascii="Calibri Light" w:hAnsi="Calibri Light"/>
-                            </w:rPr>
-                          </w:pPr>
-                          <w:r>
-                            <w:rPr>
-                              <w:rFonts w:ascii="Calibri Light" w:hAnsi="Calibri Light"/>
-                              <w:spacing w:val="-2"/>
-                            </w:rPr>
-                            <w:t>Sector</w:t>
-                          </w:r>
-                          <w:r>
-                            <w:rPr>
-                              <w:rFonts w:ascii="Calibri Light" w:hAnsi="Calibri Light"/>
-                              <w:spacing w:val="-7"/>
-                            </w:rPr>
-                            <w:t xml:space="preserve"> </w:t>
-                          </w:r>
-                          <w:r>
-                            <w:rPr>
-                              <w:rFonts w:ascii="Calibri Light" w:hAnsi="Calibri Light"/>
-                              <w:spacing w:val="-2"/>
-                            </w:rPr>
-                            <w:t>Tababela,</w:t>
-                          </w:r>
-                          <w:r>
-                            <w:rPr>
-                              <w:rFonts w:ascii="Calibri Light" w:hAnsi="Calibri Light"/>
-                              <w:spacing w:val="-6"/>
-                            </w:rPr>
-                            <w:t xml:space="preserve"> </w:t>
-                          </w:r>
-                          <w:r>
-                            <w:rPr>
-                              <w:rFonts w:ascii="Calibri Light" w:hAnsi="Calibri Light"/>
-                              <w:spacing w:val="-2"/>
-                            </w:rPr>
-                            <w:t>calle</w:t>
-                          </w:r>
-                          <w:r>
-                            <w:rPr>
-                              <w:rFonts w:ascii="Calibri Light" w:hAnsi="Calibri Light"/>
-                              <w:spacing w:val="-3"/>
-                            </w:rPr>
-                            <w:t xml:space="preserve"> </w:t>
-                          </w:r>
-                          <w:r>
-                            <w:rPr>
-                              <w:rFonts w:ascii="Calibri Light" w:hAnsi="Calibri Light"/>
-                              <w:spacing w:val="-2"/>
-                            </w:rPr>
-                            <w:t>1</w:t>
-                          </w:r>
-                          <w:r>
-                            <w:rPr>
-                              <w:rFonts w:ascii="Calibri Light" w:hAnsi="Calibri Light"/>
-                              <w:spacing w:val="-5"/>
-                            </w:rPr>
-                            <w:t xml:space="preserve"> </w:t>
-                          </w:r>
-                          <w:r>
-                            <w:rPr>
-                              <w:rFonts w:ascii="Calibri Light" w:hAnsi="Calibri Light"/>
-                              <w:spacing w:val="-2"/>
-                            </w:rPr>
-                            <w:t>de</w:t>
-                          </w:r>
-                          <w:r>
-                            <w:rPr>
-                              <w:rFonts w:ascii="Calibri Light" w:hAnsi="Calibri Light"/>
-                              <w:spacing w:val="-3"/>
-                            </w:rPr>
-                            <w:t xml:space="preserve"> </w:t>
-                          </w:r>
-                          <w:r>
-                            <w:rPr>
-                              <w:rFonts w:ascii="Calibri Light" w:hAnsi="Calibri Light"/>
-                              <w:spacing w:val="-2"/>
-                            </w:rPr>
-                            <w:t>noviembre</w:t>
-                          </w:r>
-                          <w:r>
-                            <w:rPr>
-                              <w:rFonts w:ascii="Calibri Light" w:hAnsi="Calibri Light"/>
-                              <w:spacing w:val="-6"/>
-                            </w:rPr>
-                            <w:t xml:space="preserve"> </w:t>
-                          </w:r>
-                          <w:r>
-                            <w:rPr>
-                              <w:rFonts w:ascii="Calibri Light" w:hAnsi="Calibri Light"/>
-                              <w:spacing w:val="-2"/>
-                            </w:rPr>
-                            <w:t>OE1-189</w:t>
-                          </w:r>
-                          <w:r>
-                            <w:rPr>
-                              <w:rFonts w:ascii="Calibri Light" w:hAnsi="Calibri Light"/>
-                              <w:spacing w:val="-5"/>
-                            </w:rPr>
-                            <w:t xml:space="preserve"> </w:t>
-                          </w:r>
-                          <w:r>
-                            <w:rPr>
-                              <w:rFonts w:ascii="Calibri Light" w:hAnsi="Calibri Light"/>
-                              <w:spacing w:val="-2"/>
-                            </w:rPr>
-                            <w:t>entre</w:t>
-                          </w:r>
-                          <w:r>
-                            <w:rPr>
-                              <w:rFonts w:ascii="Calibri Light" w:hAnsi="Calibri Light"/>
-                              <w:spacing w:val="-3"/>
-                            </w:rPr>
-                            <w:t xml:space="preserve"> </w:t>
-                          </w:r>
-                          <w:r>
-                            <w:rPr>
-                              <w:rFonts w:ascii="Calibri Light" w:hAnsi="Calibri Light"/>
-                              <w:spacing w:val="-2"/>
-                            </w:rPr>
-                            <w:t>24</w:t>
-                          </w:r>
-                          <w:r>
-                            <w:rPr>
-                              <w:rFonts w:ascii="Calibri Light" w:hAnsi="Calibri Light"/>
-                              <w:spacing w:val="-1"/>
-                            </w:rPr>
-                            <w:t xml:space="preserve"> </w:t>
-                          </w:r>
-                          <w:r>
-                            <w:rPr>
-                              <w:rFonts w:ascii="Calibri Light" w:hAnsi="Calibri Light"/>
-                              <w:spacing w:val="-2"/>
-                            </w:rPr>
-                            <w:t>de</w:t>
-                          </w:r>
-                          <w:r>
-                            <w:rPr>
-                              <w:rFonts w:ascii="Calibri Light" w:hAnsi="Calibri Light"/>
-                              <w:spacing w:val="-4"/>
-                            </w:rPr>
-                            <w:t xml:space="preserve"> </w:t>
-                          </w:r>
-                          <w:r>
-                            <w:rPr>
-                              <w:rFonts w:ascii="Calibri Light" w:hAnsi="Calibri Light"/>
-                              <w:spacing w:val="-2"/>
-                            </w:rPr>
-                            <w:t>septiembre</w:t>
-                          </w:r>
-                          <w:r>
-                            <w:rPr>
-                              <w:rFonts w:ascii="Calibri Light" w:hAnsi="Calibri Light"/>
-                              <w:spacing w:val="-3"/>
-                            </w:rPr>
-                            <w:t xml:space="preserve"> </w:t>
-                          </w:r>
-                          <w:r>
-                            <w:rPr>
-                              <w:rFonts w:ascii="Calibri Light" w:hAnsi="Calibri Light"/>
-                              <w:spacing w:val="-2"/>
-                            </w:rPr>
-                            <w:t>y</w:t>
-                          </w:r>
-                          <w:r>
-                            <w:rPr>
-                              <w:rFonts w:ascii="Calibri Light" w:hAnsi="Calibri Light"/>
-                              <w:spacing w:val="-4"/>
-                            </w:rPr>
-                            <w:t xml:space="preserve"> </w:t>
-                          </w:r>
-                          <w:r>
-                            <w:rPr>
-                              <w:rFonts w:ascii="Calibri Light" w:hAnsi="Calibri Light"/>
-                              <w:spacing w:val="-2"/>
-                            </w:rPr>
-                            <w:t>Tulio</w:t>
-                          </w:r>
-                          <w:r>
-                            <w:rPr>
-                              <w:rFonts w:ascii="Calibri Light" w:hAnsi="Calibri Light"/>
-                              <w:spacing w:val="-5"/>
-                            </w:rPr>
-                            <w:t xml:space="preserve"> </w:t>
-                          </w:r>
-                          <w:r>
-                            <w:rPr>
-                              <w:rFonts w:ascii="Calibri Light" w:hAnsi="Calibri Light"/>
-                              <w:spacing w:val="-2"/>
-                            </w:rPr>
-                            <w:t>Garzón</w:t>
-                          </w:r>
-                        </w:p>
-                        <w:p>
-                          <w:pPr>
-                            <w:pStyle w:val="Header"/>
-                            <w:spacing w:before="38"/>
-                            <w:ind w:left="20"/>
-                            <w:rPr>
-                              <w:rFonts w:ascii="Calibri Light"/>
-                            </w:rPr>
-                          </w:pPr>
-                          <w:r>
-                            <w:rPr>
-                              <w:rFonts w:ascii="Calibri Light"/>
-                            </w:rPr>
-                            <w:t>Telf.</w:t>
-                          </w:r>
-                          <w:r>
-                            <w:rPr>
-                              <w:rFonts w:ascii="Calibri Light"/>
-                              <w:spacing w:val="-12"/>
-                            </w:rPr>
-                            <w:t xml:space="preserve"> </w:t>
-                          </w:r>
-                          <w:r>
-                            <w:rPr>
-                              <w:rFonts w:ascii="Calibri Light"/>
-                            </w:rPr>
-                            <w:t>2391223</w:t>
-                          </w:r>
-                          <w:r>
-                            <w:rPr>
-                              <w:rFonts w:ascii="Calibri Light"/>
-                              <w:spacing w:val="-12"/>
-                            </w:rPr>
-                            <w:t xml:space="preserve"> </w:t>
-                          </w:r>
-                          <w:r>
-                            <w:rPr>
-                              <w:rFonts w:ascii="Calibri Light"/>
-                            </w:rPr>
-                            <w:t>/</w:t>
-                          </w:r>
-                          <w:r>
-                            <w:rPr>
-                              <w:rFonts w:ascii="Calibri Light"/>
-                              <w:spacing w:val="-11"/>
-                            </w:rPr>
-                            <w:t xml:space="preserve"> </w:t>
-                          </w:r>
-                          <w:r>
-                            <w:rPr>
-                              <w:rFonts w:ascii="Calibri Light"/>
-                              <w:spacing w:val="-2"/>
-                            </w:rPr>
-                            <w:t>0981737082</w:t>
-                          </w:r>
-                        </w:p>
-                        <w:p>
-                          <w:pPr>
-                            <w:spacing w:before="44"/>
-                            <w:ind w:left="20"/>
-                            <w:rPr>
-                              <w:rFonts w:ascii="Calibri Light"/>
-                              <w:sz w:val="24"/>
-                            </w:rPr>
-                          </w:pPr>
-                          <w:hyperlink r:id="rId1">
-                            <w:r>
-                              <w:rPr>
-                                <w:rFonts w:ascii="Calibri Light"/>
-                                <w:spacing w:val="-2"/>
-                                <w:sz w:val="24"/>
-                              </w:rPr>
-                              <w:t>www.hosteriaairportgarden.com</w:t>
-                            </w:r>
-                          </w:hyperlink>
-                        </w:p>
-                      </w:txbxContent>
-                    </wps:txbx>
-                    <wps:bodyPr wrap="square" lIns="0" tIns="0" rIns="0" bIns="0" rtlCol="0">
-                      <a:noAutofit/>
-                    </wps:bodyPr>
-                  </wps:wsp>
-                </a:graphicData>
-              </a:graphic>
-            </wp:anchor>
-          </w:drawing>
-        </mc:Choice>
-        <mc:Fallback>
-          <w:pict>
-            <v:shapetype w14:anchorId="3D766ED5" id="_x0000_t202" coordsize="21600,21600" o:spt="202" path="m,l,21600r21600,l21600,xe">
-              <v:stroke joinstyle="miter"/>
-              <v:path gradientshapeok="t" o:connecttype="rect"/>
-            </v:shapetype>
-            <v:shape id="Textbox 2" o:spid="_x0000_s1026" type="#_x0000_t202" style="position:absolute;margin-left:84.1pt;margin-top:746.35pt;width:376.5pt;height:45.2pt;z-index:-251655168;visibility:visible;mso-wrap-style:square;mso-wrap-distance-left:0;mso-wrap-distance-top:0;mso-wrap-distance-right:0;mso-wrap-distance-bottom:0;mso-position-horizontal:absolute;mso-position-horizontal-relative:page;mso-position-vertical:absolute;mso-position-vertical-relative:page;v-text-anchor:top" o:gfxdata="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" filled="f" stroked="f">
-              <v:textbox inset="0,0,0,0">
-                <w:txbxContent>
-                  <w:p>
-                    <w:pPr>
-                      <w:pStyle w:val="Header"/>
-                      <w:spacing w:line="245" w:lineRule="exact"/>
-                      <w:ind w:left="20"/>
-                      <w:rPr>
-                        <w:rFonts w:ascii="Calibri Light" w:hAnsi="Calibri Light"/>
-                      </w:rPr>
-                    </w:pPr>
-                    <w:r>
-                      <w:rPr>
-                        <w:rFonts w:ascii="Calibri Light" w:hAnsi="Calibri Light"/>
-                        <w:spacing w:val="-2"/>
-                      </w:rPr>
-                      <w:t>Sector</w:t>
-                    </w:r>
-                    <w:r>
-                      <w:rPr>
-                        <w:rFonts w:ascii="Calibri Light" w:hAnsi="Calibri Light"/>
-                        <w:spacing w:val="-7"/>
-                      </w:rPr>
-                      <w:t xml:space="preserve"> </w:t>
-                    </w:r>
-                    <w:r>
-                      <w:rPr>
-                        <w:rFonts w:ascii="Calibri Light" w:hAnsi="Calibri Light"/>
-                        <w:spacing w:val="-2"/>
-                      </w:rPr>
-                      <w:t>Tababela,</w:t>
-                    </w:r>
-                    <w:r>
-                      <w:rPr>
-                        <w:rFonts w:ascii="Calibri Light" w:hAnsi="Calibri Light"/>
-                        <w:spacing w:val="-6"/>
-                      </w:rPr>
-                      <w:t xml:space="preserve"> </w:t>
-                    </w:r>
-                    <w:r>
-                      <w:rPr>
-                        <w:rFonts w:ascii="Calibri Light" w:hAnsi="Calibri Light"/>
-                        <w:spacing w:val="-2"/>
-                      </w:rPr>
-                      <w:t>calle</w:t>
-                    </w:r>
-                    <w:r>
-                      <w:rPr>
-                        <w:rFonts w:ascii="Calibri Light" w:hAnsi="Calibri Light"/>
-                        <w:spacing w:val="-3"/>
-                      </w:rPr>
-                      <w:t xml:space="preserve"> </w:t>
-                    </w:r>
-                    <w:r>
-                      <w:rPr>
-                        <w:rFonts w:ascii="Calibri Light" w:hAnsi="Calibri Light"/>
-                        <w:spacing w:val="-2"/>
-                      </w:rPr>
-                      <w:t>1</w:t>
-                    </w:r>
-                    <w:r>
-                      <w:rPr>
-                        <w:rFonts w:ascii="Calibri Light" w:hAnsi="Calibri Light"/>
-                        <w:spacing w:val="-5"/>
-                      </w:rPr>
-                      <w:t xml:space="preserve"> </w:t>
-                    </w:r>
-                    <w:r>
-                      <w:rPr>
-                        <w:rFonts w:ascii="Calibri Light" w:hAnsi="Calibri Light"/>
-                        <w:spacing w:val="-2"/>
-                      </w:rPr>
-                      <w:t>de</w:t>
-                    </w:r>
-                    <w:r>
-                      <w:rPr>
-                        <w:rFonts w:ascii="Calibri Light" w:hAnsi="Calibri Light"/>
-                        <w:spacing w:val="-3"/>
-                      </w:rPr>
-                      <w:t xml:space="preserve"> </w:t>
-                    </w:r>
-                    <w:r>
-                      <w:rPr>
-                        <w:rFonts w:ascii="Calibri Light" w:hAnsi="Calibri Light"/>
-                        <w:spacing w:val="-2"/>
-                      </w:rPr>
-                      <w:t>noviembre</w:t>
-                    </w:r>
-                    <w:r>
-                      <w:rPr>
-                        <w:rFonts w:ascii="Calibri Light" w:hAnsi="Calibri Light"/>
-                        <w:spacing w:val="-6"/>
-                      </w:rPr>
-                      <w:t xml:space="preserve"> </w:t>
-                    </w:r>
-                    <w:r>
-                      <w:rPr>
-                        <w:rFonts w:ascii="Calibri Light" w:hAnsi="Calibri Light"/>
-                        <w:spacing w:val="-2"/>
-                      </w:rPr>
-                      <w:t>OE1-189</w:t>
-                    </w:r>
-                    <w:r>
-                      <w:rPr>
-                        <w:rFonts w:ascii="Calibri Light" w:hAnsi="Calibri Light"/>
-                        <w:spacing w:val="-5"/>
-                      </w:rPr>
-                      <w:t xml:space="preserve"> </w:t>
-                    </w:r>
-                    <w:r>
-                      <w:rPr>
-                        <w:rFonts w:ascii="Calibri Light" w:hAnsi="Calibri Light"/>
-                        <w:spacing w:val="-2"/>
-                      </w:rPr>
-                      <w:t>entre</w:t>
-                    </w:r>
-                    <w:r>
-                      <w:rPr>
-                        <w:rFonts w:ascii="Calibri Light" w:hAnsi="Calibri Light"/>
-                        <w:spacing w:val="-3"/>
-                      </w:rPr>
-                      <w:t xml:space="preserve"> </w:t>
-                    </w:r>
-                    <w:r>
-                      <w:rPr>
-                        <w:rFonts w:ascii="Calibri Light" w:hAnsi="Calibri Light"/>
-                        <w:spacing w:val="-2"/>
-                      </w:rPr>
-                      <w:t>24</w:t>
-                    </w:r>
-                    <w:r>
-                      <w:rPr>
-                        <w:rFonts w:ascii="Calibri Light" w:hAnsi="Calibri Light"/>
-                        <w:spacing w:val="-1"/>
-                      </w:rPr>
-                      <w:t xml:space="preserve"> </w:t>
-                    </w:r>
-                    <w:r>
-                      <w:rPr>
-                        <w:rFonts w:ascii="Calibri Light" w:hAnsi="Calibri Light"/>
-                        <w:spacing w:val="-2"/>
-                      </w:rPr>
-                      <w:t>de</w:t>
-                    </w:r>
-                    <w:r>
-                      <w:rPr>
-                        <w:rFonts w:ascii="Calibri Light" w:hAnsi="Calibri Light"/>
-                        <w:spacing w:val="-4"/>
-                      </w:rPr>
-                      <w:t xml:space="preserve"> </w:t>
-                    </w:r>
-                    <w:r>
-                      <w:rPr>
-                        <w:rFonts w:ascii="Calibri Light" w:hAnsi="Calibri Light"/>
-                        <w:spacing w:val="-2"/>
-                      </w:rPr>
-                      <w:t>septiembre</w:t>
-                    </w:r>
-                    <w:r>
-                      <w:rPr>
-                        <w:rFonts w:ascii="Calibri Light" w:hAnsi="Calibri Light"/>
-                        <w:spacing w:val="-3"/>
-                      </w:rPr>
-                      <w:t xml:space="preserve"> </w:t>
-                    </w:r>
-                    <w:r>
-                      <w:rPr>
-                        <w:rFonts w:ascii="Calibri Light" w:hAnsi="Calibri Light"/>
-                        <w:spacing w:val="-2"/>
-                      </w:rPr>
-                      <w:t>y</w:t>
-                    </w:r>
-                    <w:r>
-                      <w:rPr>
-                        <w:rFonts w:ascii="Calibri Light" w:hAnsi="Calibri Light"/>
-                        <w:spacing w:val="-4"/>
-                      </w:rPr>
-                      <w:t xml:space="preserve"> </w:t>
-                    </w:r>
-                    <w:r>
-                      <w:rPr>
-                        <w:rFonts w:ascii="Calibri Light" w:hAnsi="Calibri Light"/>
-                        <w:spacing w:val="-2"/>
-                      </w:rPr>
-                      <w:t>Tulio</w:t>
-                    </w:r>
-                    <w:r>
-                      <w:rPr>
-                        <w:rFonts w:ascii="Calibri Light" w:hAnsi="Calibri Light"/>
-                        <w:spacing w:val="-5"/>
-                      </w:rPr>
-                      <w:t xml:space="preserve"> </w:t>
-                    </w:r>
-                    <w:r>
-                      <w:rPr>
-                        <w:rFonts w:ascii="Calibri Light" w:hAnsi="Calibri Light"/>
-                        <w:spacing w:val="-2"/>
-                      </w:rPr>
-                      <w:t>Garzón</w:t>
-                    </w:r>
-                  </w:p>
-                  <w:p>
-                    <w:pPr>
-                      <w:pStyle w:val="Header"/>
-                      <w:spacing w:before="38"/>
-                      <w:ind w:left="20"/>
-                      <w:rPr>
-                        <w:rFonts w:ascii="Calibri Light"/>
-                      </w:rPr>
-                    </w:pPr>
-                    <w:r>
-                      <w:rPr>
-                        <w:rFonts w:ascii="Calibri Light"/>
-                      </w:rPr>
-                      <w:t>Telf.</w:t>
-                    </w:r>
-                    <w:r>
-                      <w:rPr>
-                        <w:rFonts w:ascii="Calibri Light"/>
-                        <w:spacing w:val="-12"/>
-                      </w:rPr>
-                      <w:t xml:space="preserve"> </w:t>
-                    </w:r>
-                    <w:r>
-                      <w:rPr>
-                        <w:rFonts w:ascii="Calibri Light"/>
-                      </w:rPr>
-                      <w:t>2391223</w:t>
-                    </w:r>
-                    <w:r>
-                      <w:rPr>
-                        <w:rFonts w:ascii="Calibri Light"/>
-                        <w:spacing w:val="-12"/>
-                      </w:rPr>
-                      <w:t xml:space="preserve"> </w:t>
-                    </w:r>
-                    <w:r>
-                      <w:rPr>
-                        <w:rFonts w:ascii="Calibri Light"/>
-                      </w:rPr>
-                      <w:t>/</w:t>
-                    </w:r>
-                    <w:r>
-                      <w:rPr>
-                        <w:rFonts w:ascii="Calibri Light"/>
-                        <w:spacing w:val="-11"/>
-                      </w:rPr>
-                      <w:t xml:space="preserve"> </w:t>
-                    </w:r>
-                    <w:r>
-                      <w:rPr>
-                        <w:rFonts w:ascii="Calibri Light"/>
-                        <w:spacing w:val="-2"/>
-                      </w:rPr>
-                      <w:t>0981737082</w:t>
-                    </w:r>
-                  </w:p>
-                  <w:p>
-                    <w:pPr>
-                      <w:spacing w:before="44"/>
-                      <w:ind w:left="20"/>
-                      <w:rPr>
-                        <w:rFonts w:ascii="Calibri Light"/>
-                        <w:sz w:val="24"/>
-                      </w:rPr>
-                    </w:pPr>
-                    <w:hyperlink r:id="rId2">
-                      <w:r>
-                        <w:rPr>
-                          <w:rFonts w:ascii="Calibri Light"/>
-                          <w:spacing w:val="-2"/>
-                          <w:sz w:val="24"/>
-                        </w:rPr>
-                        <w:t>www.hosteriaairportgarden.com</w:t>
-                      </w:r>
-                    </w:hyperlink>
-                  </w:p>
-                </w:txbxContent>
-              </v:textbox>
-              <w10:wrap anchorx="page" anchory="page"/>
-            </v:shape>
-          </w:pict>
-        </mc:Fallback>
-      </mc:AlternateContent>
-    </w:r>
-  </w:p>
-</w:ftr>
-</file>
-
-<file path=word/footer2.xml><?xml version="1.0" encoding="utf-8"?>
 <w:ftr xmlns:wpc="http://schemas.microsoft.com/office/word/2010/wordprocessingCanvas" xmlns:cx="http://schemas.microsoft.com/office/drawing/2014/chartex" xmlns:cx1="http://schemas.microsoft.com/office/drawing/2015/9/8/chartex" xmlns:cx2="http://schemas.microsoft.com/office/drawing/2015/10/21/chartex" xmlns:cx3="http://schemas.microsoft.com/office/drawing/2016/5/9/chartex" xmlns:cx4="http://schemas.microsoft.com/office/drawing/2016/5/10/chartex" xmlns:cx5="http://schemas.microsoft.com/office/drawing/2016/5/11/chartex" xmlns:cx6="http://schemas.microsoft.com/office/drawing/2016/5/12/chartex" xmlns:cx7="http://schemas.microsoft.com/office/drawing/2016/5/13/chartex" xmlns:cx8="http://schemas.microsoft.com/office/drawing/2016/5/14/chartex" xmlns:mc="http://schemas.openxmlformats.org/markup-compatibility/2006" xmlns:aink="http://schemas.microsoft.com/office/drawing/2016/ink" xmlns:am3d="http://schemas.microsoft.com/office/drawing/2017/model3d" xmlns:o="urn:schemas-microsoft-com:office:office" xmlns:oel="http://schemas.microsoft.com/office/2019/extlst" xmlns:r="http://schemas.openxmlformats.org/officeDocument/2006/relationships" xmlns:m="http://schemas.openxmlformats.org/officeDocument/2006/math" xmlns:v="urn:schemas-microsoft-com:vml" xmlns:wp14="http://schemas.microsoft.com/office/word/2010/wordprocessingDrawing" xmlns:wp="http://schemas.openxmlformats.org/drawingml/2006/wordprocessingDrawing" xmlns:w10="urn:schemas-microsoft-com:office:word" xmlns:w="http://schemas.openxmlformats.org/wordprocessingml/2006/main" xmlns:w14="http://schemas.microsoft.com/office/word/2010/wordml" xmlns:w15="http://schemas.microsoft.com/office/word/2012/wordml" xmlns:w16cex="http://schemas.microsoft.com/office/word/2018/wordml/cex" xmlns:w16cid="http://schemas.microsoft.com/office/word/2016/wordml/cid" xmlns:w16="http://schemas.microsoft.com/office/word/2018/wordml" xmlns:w16du="http://schemas.microsoft.com/office/word/2023/wordml/word16du" xmlns:w16sdtdh="http://schemas.microsoft.com/office/word/2020/wordml/sdtdatahash" xmlns:w16sdtfl="http://schemas.microsoft.com/office/word/2024/wordml/sdtformatlock" xmlns:w16se="http://schemas.microsoft.com/office/word/2015/wordml/symex" xmlns:wpg="http://schemas.microsoft.com/office/word/2010/wordprocessingGroup" xmlns:wpi="http://schemas.microsoft.com/office/word/2010/wordprocessingInk" xmlns:wne="http://schemas.microsoft.com/office/word/2006/wordml" xmlns:wps="http://schemas.microsoft.com/office/word/2010/wordprocessingShape" mc:Ignorable="w14 w15 w16se w16cid w16 w16cex w16sdtdh w16sdtfl w16du wp14">
   <w:p>
     <w:pPr>
@@ -5058,69 +4592,6 @@
 </file>
 
 <file path=word/header1.xml><?xml version="1.0" encoding="utf-8"?>
-<w:hdr xmlns:wpc="http://schemas.microsoft.com/office/word/2010/wordprocessingCanvas" xmlns:cx="http://schemas.microsoft.com/office/drawing/2014/chartex" xmlns:cx1="http://schemas.microsoft.com/office/drawing/2015/9/8/chartex" xmlns:cx2="http://schemas.microsoft.com/office/drawing/2015/10/21/chartex" xmlns:cx3="http://schemas.microsoft.com/office/drawing/2016/5/9/chartex" xmlns:cx4="http://schemas.microsoft.com/office/drawing/2016/5/10/chartex" xmlns:cx5="http://schemas.microsoft.com/office/drawing/2016/5/11/chartex" xmlns:cx6="http://schemas.microsoft.com/office/drawing/2016/5/12/chartex" xmlns:cx7="http://schemas.microsoft.com/office/drawing/2016/5/13/chartex" xmlns:cx8="http://schemas.microsoft.com/office/drawing/2016/5/14/chartex" xmlns:mc="http://schemas.openxmlformats.org/markup-compatibility/2006" xmlns:aink="http://schemas.microsoft.com/office/drawing/2016/ink" xmlns:am3d="http://schemas.microsoft.com/office/drawing/2017/model3d" xmlns:o="urn:schemas-microsoft-com:office:office" xmlns:oel="http://schemas.microsoft.com/office/2019/extlst" xmlns:r="http://schemas.openxmlformats.org/officeDocument/2006/relationships" xmlns:m="http://schemas.openxmlformats.org/officeDocument/2006/math" xmlns:v="urn:schemas-microsoft-com:vml" xmlns:wp14="http://schemas.microsoft.com/office/word/2010/wordprocessingDrawing" xmlns:wp="http://schemas.openxmlformats.org/drawingml/2006/wordprocessingDrawing" xmlns:w10="urn:schemas-microsoft-com:office:word" xmlns:w="http://schemas.openxmlformats.org/wordprocessingml/2006/main" xmlns:w14="http://schemas.microsoft.com/office/word/2010/wordml" xmlns:w15="http://schemas.microsoft.com/office/word/2012/wordml" xmlns:w16cex="http://schemas.microsoft.com/office/word/2018/wordml/cex" xmlns:w16cid="http://schemas.microsoft.com/office/word/2016/wordml/cid" xmlns:w16="http://schemas.microsoft.com/office/word/2018/wordml" xmlns:w16du="http://schemas.microsoft.com/office/word/2023/wordml/word16du" xmlns:w16sdtdh="http://schemas.microsoft.com/office/word/2020/wordml/sdtdatahash" xmlns:w16sdtfl="http://schemas.microsoft.com/office/word/2024/wordml/sdtformatlock" xmlns:w16se="http://schemas.microsoft.com/office/word/2015/wordml/symex" xmlns:wpg="http://schemas.microsoft.com/office/word/2010/wordprocessingGroup" xmlns:wpi="http://schemas.microsoft.com/office/word/2010/wordprocessingInk" xmlns:wne="http://schemas.microsoft.com/office/word/2006/wordml" xmlns:wps="http://schemas.microsoft.com/office/word/2010/wordprocessingShape" mc:Ignorable="w14 w15 w16se w16cid w16 w16cex w16sdtdh w16sdtfl w16du wp14">
-  <w:p>
-    <w:pPr>
-      <w:pStyle w:val="BodyText"/>
-      <w:spacing w:line="14" w:lineRule="auto"/>
-      <w:rPr>
-        <w:sz w:val="20"/>
-      </w:rPr>
-    </w:pPr>
-    <w:r>
-      <w:rPr>
-        <w:noProof/>
-        <w:sz w:val="20"/>
-      </w:rPr>
-      <w:drawing>
-        <wp:anchor distT="0" distB="0" distL="0" distR="0" simplePos="0" relativeHeight="251660288" behindDoc="1" locked="0" layoutInCell="1" allowOverlap="1" wp14:anchorId="7ADEED43" wp14:editId="5541195A">
-          <wp:simplePos x="0" y="0"/>
-          <wp:positionH relativeFrom="page">
-            <wp:posOffset>2949854</wp:posOffset>
-          </wp:positionH>
-          <wp:positionV relativeFrom="page">
-            <wp:posOffset>208483</wp:posOffset>
-          </wp:positionV>
-          <wp:extent cx="1622755" cy="965606"/>
-          <wp:effectExtent l="0" t="0" r="0" b="0"/>
-          <wp:wrapNone/>
-          <wp:docPr id="1" name="Image 1"/>
-          <wp:cNvGraphicFramePr>
-            <a:graphicFrameLocks xmlns:a="http://schemas.openxmlformats.org/drawingml/2006/main"/>
-          </wp:cNvGraphicFramePr>
-          <a:graphic xmlns:a="http://schemas.openxmlformats.org/drawingml/2006/main">
-            <a:graphicData uri="http://schemas.openxmlformats.org/drawingml/2006/picture">
-              <pic:pic xmlns:pic="http://schemas.openxmlformats.org/drawingml/2006/picture">
-                <pic:nvPicPr>
-                  <pic:cNvPr id="1" name="Image 1"/>
-                  <pic:cNvPicPr/>
-                </pic:nvPicPr>
-                <pic:blipFill>
-                  <a:blip r:embed="rId1" cstate="print"/>
-                  <a:stretch>
-                    <a:fillRect/>
-                  </a:stretch>
-                </pic:blipFill>
-                <pic:spPr>
-                  <a:xfrm>
-                    <a:off x="0" y="0"/>
-                    <a:ext cx="1622755" cy="965606"/>
-                  </a:xfrm>
-                  <a:prstGeom prst="rect">
-                    <a:avLst/>
-                  </a:prstGeom>
-                </pic:spPr>
-              </pic:pic>
-            </a:graphicData>
-          </a:graphic>
-        </wp:anchor>
-      </w:drawing>
-    </w:r>
-  </w:p>
-</w:hdr>
-</file>
-
-<file path=word/header2.xml><?xml version="1.0" encoding="utf-8"?>
 <w:hdr xmlns:wpc="http://schemas.microsoft.com/office/word/2010/wordprocessingCanvas" xmlns:cx="http://schemas.microsoft.com/office/drawing/2014/chartex" xmlns:cx1="http://schemas.microsoft.com/office/drawing/2015/9/8/chartex" xmlns:cx2="http://schemas.microsoft.com/office/drawing/2015/10/21/chartex" xmlns:cx3="http://schemas.microsoft.com/office/drawing/2016/5/9/chartex" xmlns:cx4="http://schemas.microsoft.com/office/drawing/2016/5/10/chartex" xmlns:cx5="http://schemas.microsoft.com/office/drawing/2016/5/11/chartex" xmlns:cx6="http://schemas.microsoft.com/office/drawing/2016/5/12/chartex" xmlns:cx7="http://schemas.microsoft.com/office/drawing/2016/5/13/chartex" xmlns:cx8="http://schemas.microsoft.com/office/drawing/2016/5/14/chartex" xmlns:mc="http://schemas.openxmlformats.org/markup-compatibility/2006" xmlns:aink="http://schemas.microsoft.com/office/drawing/2016/ink" xmlns:am3d="http://schemas.microsoft.com/office/drawing/2017/model3d" xmlns:o="urn:schemas-microsoft-com:office:office" xmlns:oel="http://schemas.microsoft.com/office/2019/extlst" xmlns:r="http://schemas.openxmlformats.org/officeDocument/2006/relationships" xmlns:m="http://schemas.openxmlformats.org/officeDocument/2006/math" xmlns:v="urn:schemas-microsoft-com:vml" xmlns:wp14="http://schemas.microsoft.com/office/word/2010/wordprocessingDrawing" xmlns:wp="http://schemas.openxmlformats.org/drawingml/2006/wordprocessingDrawing" xmlns:w10="urn:schemas-microsoft-com:office:word" xmlns:w="http://schemas.openxmlformats.org/wordprocessingml/2006/main" xmlns:w14="http://schemas.microsoft.com/office/word/2010/wordml" xmlns:w15="http://schemas.microsoft.com/office/word/2012/wordml" xmlns:w16cex="http://schemas.microsoft.com/office/word/2018/wordml/cex" xmlns:w16cid="http://schemas.microsoft.com/office/word/2016/wordml/cid" xmlns:w16="http://schemas.microsoft.com/office/word/2018/wordml" xmlns:w16du="http://schemas.microsoft.com/office/word/2023/wordml/word16du" xmlns:w16sdtdh="http://schemas.microsoft.com/office/word/2020/wordml/sdtdatahash" xmlns:w16sdtfl="http://schemas.microsoft.com/office/word/2024/wordml/sdtformatlock" xmlns:w16se="http://schemas.microsoft.com/office/word/2015/wordml/symex" xmlns:wpg="http://schemas.microsoft.com/office/word/2010/wordprocessingGroup" xmlns:wpi="http://schemas.microsoft.com/office/word/2010/wordprocessingInk" xmlns:wne="http://schemas.microsoft.com/office/word/2006/wordml" xmlns:wps="http://schemas.microsoft.com/office/word/2010/wordprocessingShape" mc:Ignorable="w14 w15 w16se w16cid w16 w16cex w16sdtdh w16sdtfl w16du wp14">
   <w:p>
     <w:pPr>
@@ -7487,7 +6958,6 @@
     <w:next w:val="Normal"/>
     <w:link w:val="Heading2Char"/>
     <w:uiPriority w:val="9"/>
-    <w:semiHidden/>
     <w:unhideWhenUsed/>
     <w:qFormat/>
     <w:rsid w:val="00AE2E08"/>
@@ -7683,7 +7153,6 @@
     <w:basedOn w:val="DefaultParagraphFont"/>
     <w:link w:val="Heading2"/>
     <w:uiPriority w:val="9"/>
-    <w:semiHidden/>
     <w:rsid w:val="00AE2E08"/>
     <w:rPr>
       <w:rFonts w:asciiTheme="majorHAnsi" w:eastAsiaTheme="majorEastAsia" w:hAnsiTheme="majorHAnsi" w:cstheme="majorBidi"/>

</xml_diff>